<commit_message>
GUIDES-T04: align Deactivate Department success row to final audited seed [skip guides]
</commit_message>
<xml_diff>
--- a/Documents/Student-Guides/Department/T04_Deactivate_Department/T04_02_Progressive_Development_Guide.docx
+++ b/Documents/Student-Guides/Department/T04_Deactivate_Department/T04_02_Progressive_Development_Guide.docx
@@ -923,6 +923,14 @@
         </w:tc>
       </w:tr>
     </w:tbl>
+    <w:p>
+      <w:r>
+        <w:rPr>
+          <w:b/>
+        </w:rPr>
+        <w:t>Final audited T04 training row: use Department ID 5 / IT (Information Technology) for the successful Deactivate integration case because it has no active Member. Department ID 1 / CSE remains the persisted dependency-block case.</w:t>
+      </w:r>
+    </w:p>
     <w:sectPr>
       <w:pgSz w:w="12240" w:h="15840"/>
       <w:pgMar w:top="936" w:right="1080" w:bottom="936" w:left="1080" w:header="720" w:footer="720" w:gutter="0"/>

</xml_diff>